<commit_message>
feat(android): documente la validation de bout en bout du PoC (02/07/2026)
Build Android Studio compilé, app lancée sur émulateur Pixel 6, connexion
réelle à l'API compagnon confirmée (statut ALFRED + rappels réels affichés).

- Mapping competences.docx : 8 passages mis à jour ("non vérifié" -> "validé")
- Annexes techniques.docx : idem (annexe 7/12/13), captures d'écran de
  Céline préservées (7 images)
- ROADMAP.md, validation_registry.json, companion_api.py : statut upgradé
</commit_message>
<xml_diff>
--- a/docs/Mapping competences projet ALFRED.docx
+++ b/docs/Mapping competences projet ALFRED.docx
@@ -171,7 +171,7 @@
     <w:p>
       <w:r>
         <w:lastRenderedPageBreak/>
-        <w:t>À la date de rédaction du présent document, le 02/07/2026, les modules liés à Docker et MongoDB ont été validés en conditions réelles dans le projet ALFRED (conteneur actif, migration exécutée, données relues, intégration au suivi de projet). Le module Android Kotlin reste au stade de PoC : écrit, publié sur GitHub et testé côté API, mais pas encore compilé dans Android Studio. Cette dernière étape, ainsi que la consolidation générale de ces briques, sont documentées comme telles plutôt que présentées comme totalement finalisées.</w:t>
+        <w:t>À la date de rédaction du présent document, le 02/07/2026, les modules liés à Docker, MongoDB et Android Kotlin ont tous été validés en conditions réelles dans le projet ALFRED : conteneur MongoDB actif et migration exécutée, et côté Android, build compilé dans Android Studio, application lancée sur émulateur (Pixel 6, Android 14) et connexion réelle à l’API compagnon confirmée (statut ALFRED et rappels réels affichés dans l’app). La consolidation restante (authentification renforcée, produit Android complet) est documentée comme telle plutôt que présentée comme totalement finalisée.</w:t>
       </w:r>
     </w:p>
     <w:p>
@@ -1861,9 +1861,9 @@
     </w:p>
     <w:p>
       <w:r>
-        <w:t xml:space="preserve">À la date de rédaction du présent document, le 02/07/2026, cette brique Android est initiée et documentée. La compilation dans Android Studio, les tests sur émulateur ou </w:t>
+        <w:t xml:space="preserve">Cette brique Android a été validée en conditions réelles le 02/07/2026 : compilation réussie dans Android Studio (</w:t>
         <w:lastRenderedPageBreak/>
-        <w:t>terminal Android et la validation complète du parcours utilisateur sont prévus avant la fin de formation, fixée au 30/09/2026.</w:t>
+        <w:t>plugin Compose Compiler requis depuis Kotlin 2.0, corrigé au passage), application lancée sur émulateur Pixel 6 (Android 14), et connexion réelle confirmée à l’API compagnon avec affichage du statut ALFRED et des rappels réels.</w:t>
       </w:r>
     </w:p>
     <w:p>
@@ -2034,7 +2034,7 @@
           <w:b/>
           <w:bCs/>
         </w:rPr>
-        <w:t>Couvert et démontrable pour Python et le web. Partiellement couvert et en cours de mise en pratique pour Android Kotlin sous forme de PoC.</w:t>
+        <w:t>Couvert et démontrable pour Python, le web et Android Kotlin — le PoC a été compilé, exécuté sur émulateur et connecté avec succès à l’API compagnon le 02/07/2026.</w:t>
       </w:r>
     </w:p>
     <w:p>
@@ -3049,7 +3049,7 @@
     </w:p>
     <w:p>
       <w:r>
-        <w:t>À la date de rédaction du présent document, le 02/07/2026, cette brique Android est engagée et documentée. La compilation dans Android Studio, les tests sur émulateur ou terminal Android et la validation complète du parcours utilisateur font partie des travaux prévus avant la fin de formation, fixée au 30/09/2026.</w:t>
+        <w:t>Cette brique Android a été validée en conditions réelles le 02/07/2026 : compilation réussie dans Android Studio, application lancée sur émulateur Pixel 6 (Android 14), et connexion réelle confirmée à l’API compagnon (statut ALFRED et rappels réels affichés dans l’app). Reste prévu avant la fin de formation, fixée au 30/09/2026 : authentification renforcée (PIN/QR au lieu du jeton partagé) et validation complète du parcours utilisateur.</w:t>
       </w:r>
     </w:p>
     <w:p>
@@ -3263,7 +3263,7 @@
     </w:p>
     <w:p>
       <w:r>
-        <w:t>Le développement Android Kotlin est engagé et démontrable au niveau PoC. L’application Android complète est prévue dans la roadmap et les compétences associées seront mises en pratique avant le 30/09/2026.</w:t>
+        <w:t>Le développement Android Kotlin est démontrable au niveau PoC — compilé, exécuté et connecté en conditions réelles. L’application Android complète (produit final, au-delà du client compagnon) reste prévue dans la roadmap.</w:t>
       </w:r>
     </w:p>
     <w:p>
@@ -6547,7 +6547,7 @@
         </w:numPr>
       </w:pPr>
       <w:r>
-        <w:t>Android Kotlin : PoC développé, avec compilation et test Android Studio à réaliser ;</w:t>
+        <w:t>Android Kotlin : désormais couvert et démontrable — PoC compilé, exécuté et connecté en conditions réelles le 02/07/2026 (déplacé ici pour mémoire du cheminement) ;</w:t>
       </w:r>
     </w:p>
     <w:p>
@@ -6585,7 +6585,7 @@
     </w:p>
     <w:p>
       <w:r>
-        <w:t>À la date du 02/07/2026, les modules Docker et MongoDB sont validés en conditions réelles. Le PoC Android Kotlin reste, lui, au stade de PoC écrit et testé côté API — sa compilation et son exécution dans Android Studio restent à réaliser avant la fin de formation du 30/09/2026.</w:t>
+        <w:t>À la date du 02/07/2026, les modules Docker, MongoDB et le PoC Android Kotlin sont tous validés en conditions réelles — build compilé, application exécutée sur émulateur, connexion confirmée à l’API compagnon. Reste prévu avant la fin de formation du 30/09/2026 : authentification renforcée du PoC et développement du produit Android complet.</w:t>
       </w:r>
     </w:p>
     <w:p>
@@ -6915,7 +6915,7 @@
     </w:p>
     <w:p>
       <w:r>
-        <w:t>Réalisé le 02/07/2026 : le dépôt Git du PoC a été publié publiquement (github.com/cognitive-products-lab/ALFRED_ANDROID), avec un historique de commits propre (feat: PoC client compagnon Android). Restent à finaliser la compilation et l’exécution réelles dans Android Studio, non vérifiables dans l’environnement de développement utilisé pour écrire le code.</w:t>
+        <w:t>Réalisé le 02/07/2026 : le dépôt Git du PoC a été publié publiquement (github.com/cognitive-products-lab/ALFRED_ANDROID), avec un historique de commits propre. Build compilé avec succès dans Android Studio (ajout du plugin Compose Compiler requis depuis Kotlin 2.0), application lancée sur émulateur Pixel 6 (Android 14), et connexion réelle confirmée à l’API compagnon — statut ALFRED et rappels réels affichés dans l’app.</w:t>
       </w:r>
     </w:p>
     <w:p>
@@ -7770,12 +7770,12 @@
         </w:numPr>
       </w:pPr>
       <w:r>
-        <w:t>ALFRED_ANDROID est un PoC Android natif Kotlin de type client compagnon, publié sur github.com/cognitive-products-lab/ALFRED_ANDROID, en attente de validation de compilation dans Android Studio.</w:t>
-      </w:r>
-    </w:p>
-    <w:p>
-      <w:r>
-        <w:t>Au 02/07/2026, MongoDB et Docker sont validés en conditions réelles et intégrés au suivi de projet (dashboards, tests, scans sécurité). Seul le PoC Android Kotlin reste au milieu de sa trajectoire de consolidation : écrit, publié et testé côté API, mais non encore compilé dans Android Studio — cette dernière étape est prévue avant la fin de formation du 30/09/2026.</w:t>
+        <w:t>ALFRED_ANDROID est un PoC Android natif Kotlin de type client compagnon, publié sur github.com/cognitive-products-lab/ALFRED_ANDROID, compilé avec succès dans Android Studio et validé en conditions réelles (application lancée sur émulateur, connexion confirmée à l’API compagnon).</w:t>
+      </w:r>
+    </w:p>
+    <w:p>
+      <w:r>
+        <w:t>Au 02/07/2026, MongoDB, Docker et le PoC Android Kotlin sont tous validés en conditions réelles et intégrés au suivi de projet (dashboards, tests, scans sécurité). Le PoC Android a été compilé, exécuté sur émulateur et connecté avec succès à l’API compagnon. La consolidation restante — authentification renforcée et produit Android complet — reste prévue avant la fin de formation du 30/09/2026.</w:t>
       </w:r>
     </w:p>
     <w:p>

</xml_diff>